<commit_message>
style: remove Oxford commas (commas before 'and') from all specs and regenerate deliverables
</commit_message>
<xml_diff>
--- a/project_deliverables/Phase2-5_SRS-Traceability-VV-Management-DB-Design.docx
+++ b/project_deliverables/Phase2-5_SRS-Traceability-VV-Management-DB-Design.docx
@@ -164,7 +164,7 @@
           <w:color w:val="000000"/>
           <w:sz w:val="24"/>
         </w:rPr>
-        <w:t>The DCMS is a Dual Phase Operations Management System. During the day, it functions as a Real Time Point of Sale to process individual sales, calculate VAT, update inventory, and print physical receipts for customers. In the evening, it functions as an End of Day Reconciliation Engine, allowing the Sales Manager to balance multi channel payment drawers, log operational expenses, compute cash variances, and generate a final daily summary report for the Business Owner.</w:t>
+        <w:t>The DCMS is a Dual Phase Operations Management System. During the day, it functions as a Real Time Point of Sale to process individual sales, calculate VAT, update inventory and print physical receipts for customers. In the evening, it functions as an End of Day Reconciliation Engine, allowing the Sales Manager to balance multi channel payment drawers, log operational expenses, compute cash variances and generate a final daily summary report for the Business Owner.</w:t>
       </w:r>
     </w:p>
     <w:p>
@@ -312,7 +312,7 @@
           <w:color w:val="000000"/>
           <w:sz w:val="24"/>
         </w:rPr>
-        <w:t>Acts as supervisor, cashier, payroll distributor, and record keeper. Requires a system that reduces end of day reconciliation workload and automates receipt generation during the day.</w:t>
+        <w:t>Acts as supervisor, cashier, payroll distributor and record keeper. Requires a system that reduces end of day reconciliation workload and automates receipt generation during the day.</w:t>
       </w:r>
     </w:p>
     <w:p>
@@ -404,7 +404,7 @@
           <w:color w:val="000000"/>
           <w:sz w:val="24"/>
         </w:rPr>
-        <w:t>Dictates tax compliance, VAT, and receipting standards. System must ensure financial outputs meet audit expectations.</w:t>
+        <w:t>Dictates tax compliance, VAT and receipting standards. System must ensure financial outputs meet audit expectations.</w:t>
       </w:r>
     </w:p>
     <w:p>
@@ -593,7 +593,7 @@
           <w:color w:val="000000"/>
           <w:sz w:val="24"/>
         </w:rPr>
-        <w:t>The Sales Manager possesses basic digital literacy to operate a mouse, keyboard, and web browser.</w:t>
+        <w:t>The Sales Manager possesses basic digital literacy to operate a mouse, keyboard and web browser.</w:t>
       </w:r>
     </w:p>
     <w:p>
@@ -704,7 +704,7 @@
           <w:color w:val="000000"/>
           <w:sz w:val="24"/>
         </w:rPr>
-        <w:t>The system shall allow the Sales Manager to log an individual sale by entering the product, quantity, unit price, and payment method (Cash, Mobile Money, Bank Deposit).</w:t>
+        <w:t>The system shall allow the Sales Manager to log an individual sale by entering the product, quantity, unit price and payment method (Cash, Mobile Money, Bank Deposit).</w:t>
       </w:r>
     </w:p>
     <w:p>
@@ -773,7 +773,7 @@
           <w:color w:val="000000"/>
           <w:sz w:val="24"/>
         </w:rPr>
-        <w:t>Upon saving a sale, the system shall immediately format and send a physical receipt to the attached printer containing the sequential ID, date, customer name, product description, quantity, unit price, subtotal, VAT, total amount, and payment method.</w:t>
+        <w:t>Upon saving a sale, the system shall immediately format and send a physical receipt to the attached printer containing the sequential ID, date, customer name, product description, quantity, unit price, subtotal, VAT, total amount and payment method.</w:t>
       </w:r>
     </w:p>
     <w:p>
@@ -833,7 +833,7 @@
           <w:color w:val="000000"/>
           <w:sz w:val="24"/>
         </w:rPr>
-        <w:t>The system shall maintain three independent virtual drawer balances: Cash, Mobile Money, and Bank Deposit. Each sale shall increment the corresponding drawer balance based on its payment method.</w:t>
+        <w:t>The system shall maintain three independent virtual drawer balances: Cash, Mobile Money and Bank Deposit. Each sale shall increment the corresponding drawer balance based on its payment method.</w:t>
       </w:r>
     </w:p>
     <w:p>
@@ -1170,7 +1170,7 @@
           <w:color w:val="000000"/>
           <w:sz w:val="24"/>
         </w:rPr>
-        <w:t>The system shall enforce strict RBAC at both the database and application layers. The Sales Manager role shall have INSERT/UPDATE on Sales, Attendance, and Expenses. The Owner role shall have SELECT on all tables and views including restricted views for Total Profit and Tax Liability. The Secretary role (future scaling) shall have restricted INSERT/SELECT permissions.</w:t>
+        <w:t>The system shall enforce strict RBAC at both the database and application layers. The Sales Manager role shall have INSERT/UPDATE on Sales, Attendance and Expenses. The Owner role shall have SELECT on all tables and views including restricted views for Total Profit and Tax Liability. The Secretary role (future scaling) shall have restricted INSERT/SELECT permissions.</w:t>
       </w:r>
     </w:p>
     <w:p>
@@ -1193,7 +1193,7 @@
           <w:color w:val="000000"/>
           <w:sz w:val="24"/>
         </w:rPr>
-        <w:t>The system shall maintain an immutable Audit Log table recording the User ID, Timestamp, Action Type (for example, VOID SALE, LOG EXPENSE), and Previous Value for any modification to financial records.</w:t>
+        <w:t>The system shall maintain an immutable Audit Log table recording the User ID, Timestamp, Action Type (for example, VOID SALE, LOG EXPENSE) and Previous Value for any modification to financial records.</w:t>
       </w:r>
     </w:p>
     <w:p>
@@ -1258,7 +1258,7 @@
           <w:color w:val="000000"/>
           <w:sz w:val="24"/>
         </w:rPr>
-        <w:t>The following matrix links each business problem observed during elicitation to the specific requirement that solves it, and the database artifact that implements it.</w:t>
+        <w:t>The following matrix links each business problem observed during elicitation to the specific requirement that solves it and the database artifact that implements it.</w:t>
       </w:r>
     </w:p>
     <w:tbl>
@@ -1619,7 +1619,7 @@
                 <w:color w:val="000000"/>
                 <w:sz w:val="24"/>
               </w:rPr>
-              <w:t>Mixing of Cash, Mobile Money, and Bank balances</w:t>
+              <w:t>Mixing of Cash, Mobile Money and Bank balances</w:t>
             </w:r>
           </w:p>
         </w:tc>
@@ -3188,7 +3188,7 @@
           <w:color w:val="000000"/>
           <w:sz w:val="24"/>
         </w:rPr>
-        <w:t>Change Request Submission: Any stakeholder may submit a change request describing the proposed change, the reason, and the expected impact.</w:t>
+        <w:t>Change Request Submission: Any stakeholder may submit a change request describing the proposed change, the reason and the expected impact.</w:t>
       </w:r>
     </w:p>
     <w:p>
@@ -3211,7 +3211,7 @@
           <w:color w:val="000000"/>
           <w:sz w:val="24"/>
         </w:rPr>
-        <w:t>Impact Analysis: Group K assesses the impact on the SRS, database schema, stored procedures, triggers, views, and UI. The analysis includes effort estimation and risk assessment.</w:t>
+        <w:t>Impact Analysis: Group K assesses the impact on the SRS, database schema, stored procedures, triggers, views and UI. The analysis includes effort estimation and risk assessment.</w:t>
       </w:r>
     </w:p>
     <w:p>
@@ -3257,7 +3257,7 @@
           <w:color w:val="000000"/>
           <w:sz w:val="24"/>
         </w:rPr>
-        <w:t>Implementation: The change is implemented in the SRS, the database schema, and the application code. The Requirements Traceability Matrix is updated to reflect the new or modified requirement.</w:t>
+        <w:t>Implementation: The change is implemented in the SRS, the database schema and the application code. The Requirements Traceability Matrix is updated to reflect the new or modified requirement.</w:t>
       </w:r>
     </w:p>
     <w:p>
@@ -3285,7 +3285,7 @@
           <w:color w:val="000000"/>
           <w:sz w:val="24"/>
         </w:rPr>
-        <w:t>All requirements documents, database schemas, and source code are version controlled in the project Git repository (https://github.com/mugmarp/requirements engineering project exercise). Each change to the SRS is committed with a message referencing the Change Request ID.</w:t>
+        <w:t>All requirements documents, database schemas and source code are version controlled in the project Git repository (https://github.com/mugmarp/requirements engineering project exercise). Each change to the SRS is committed with a message referencing the Change Request ID.</w:t>
       </w:r>
     </w:p>
     <w:p>
@@ -3313,7 +3313,7 @@
           <w:color w:val="000000"/>
           <w:sz w:val="24"/>
         </w:rPr>
-        <w:t>Each requirement carries the following attributes: ID, Title, Type (Functional or Non Functional), Module, Priority (High, Medium, Low), Status (Proposed, Approved, Implemented, Verified), Source (Elicitation Fact, Business Assumption, Gap Synthesis), and Traceability Links.</w:t>
+        <w:t>Each requirement carries the following attributes: ID, Title, Type (Functional or Non Functional), Module, Priority (High, Medium, Low), Status (Proposed, Approved, Implemented, Verified), Source (Elicitation Fact, Business Assumption, Gap Synthesis) and Traceability Links.</w:t>
       </w:r>
     </w:p>
     <w:p>
@@ -4319,7 +4319,7 @@
           <w:color w:val="000000"/>
           <w:sz w:val="24"/>
         </w:rPr>
-        <w:t>CloseDay() RETURNS Daily_Reconciliation_Record: Computes Expected_Cash per REQ FUN REC 03, creates the Daily_Reconciliation record, and marks the day as closed. Requires Actual_Cash input and mandatory Explanation if Variance != 0.</w:t>
+        <w:t>CloseDay() RETURNS Daily_Reconciliation_Record: Computes Expected_Cash per REQ FUN REC 03, creates the Daily_Reconciliation record and marks the day as closed. Requires Actual_Cash input and mandatory Explanation if Variance != 0.</w:t>
       </w:r>
     </w:p>
     <w:p>
@@ -4473,7 +4473,7 @@
           <w:color w:val="000000"/>
           <w:sz w:val="24"/>
         </w:rPr>
-        <w:t>Daily_Reconciliation_Report: Combines Daily_Reconciliation, Virtual_Drawers, and Operational_Expenses for the final Owner report.</w:t>
+        <w:t>Daily_Reconciliation_Report: Combines Daily_Reconciliation, Virtual_Drawers and Operational_Expenses for the final Owner report.</w:t>
       </w:r>
     </w:p>
     <w:sectPr>

</xml_diff>